<commit_message>
Remove + qualifier after $10M and 22% across entire site
Co-Authored-By: Claude Sonnet 4.6 <noreply@anthropic.com>
</commit_message>
<xml_diff>
--- a/positioning-brief-draft.docx
+++ b/positioning-brief-draft.docx
@@ -32,6 +32,20 @@
     </w:p>
     <w:p>
       <w:pPr>
+        <w:spacing w:after="80"/>
+      </w:pPr>
+      <w:r>
+        <w:rPr>
+          <w:rFonts w:ascii="Arial" w:cs="Arial" w:eastAsia="Arial" w:hAnsi="Arial"/>
+          <w:color w:val="333333"/>
+          <w:sz w:val="24"/>
+          <w:szCs w:val="24"/>
+        </w:rPr>
+        <w:t xml:space="preserve">B2B Vertical SaaS CEO | AI → EBITDA</w:t>
+      </w:r>
+    </w:p>
+    <w:p>
+      <w:pPr>
         <w:spacing w:after="200"/>
       </w:pPr>
       <w:r>
@@ -41,7 +55,7 @@
           <w:sz w:val="22"/>
           <w:szCs w:val="22"/>
         </w:rPr>
-        <w:t xml:space="preserve">Draft — March 2026</w:t>
+        <w:t xml:space="preserve">Draft — March 23, 2026</w:t>
       </w:r>
     </w:p>
     <w:p>
@@ -69,43 +83,124 @@
           <w:sz w:val="24"/>
           <w:szCs w:val="24"/>
         </w:rPr>
-        <w:t xml:space="preserve">I fix PE-backed and growth-stage B2B vertical SaaS companies in the $10M–$75M revenue range that have built working AI but have not converted it into durable financial performance.</w:t>
-      </w:r>
-    </w:p>
-    <w:p>
-      <w:pPr>
-        <w:spacing w:after="200"/>
-      </w:pPr>
-      <w:r>
-        <w:rPr>
-          <w:sz w:val="24"/>
-          <w:szCs w:val="24"/>
-        </w:rPr>
-        <w:t xml:space="preserve">These are not early-stage AI experiments. The technology works. The product has customers. But the commercial infrastructure—pricing, packaging, go-to-market, operating cadence—was built for the old SaaS model and has not been rebuilt for AI delivery. The company is stuck between two identities: a SaaS company that added AI features and an AI company that has not yet figured out how to monetize what it built.</w:t>
-      </w:r>
-    </w:p>
-    <w:p>
-      <w:pPr>
-        <w:spacing w:after="200"/>
-      </w:pPr>
-      <w:r>
-        <w:rPr>
-          <w:sz w:val="24"/>
-          <w:szCs w:val="24"/>
-        </w:rPr>
-        <w:t xml:space="preserve">The profile is consistent. B2B. Vertical. Serving mid-market or enterprise customers in workflows where AI can move a measurable line on the customer’s P&amp;L. Customer experience, support automation, and service delivery are the verticals I know best, but the pattern applies anywhere AI replaces labor-intensive workflow steps with outcome-based delivery.</w:t>
-      </w:r>
-    </w:p>
-    <w:p>
-      <w:pPr>
-        <w:spacing w:after="200"/>
-      </w:pPr>
-      <w:r>
-        <w:rPr>
-          <w:sz w:val="24"/>
-          <w:szCs w:val="24"/>
-        </w:rPr>
-        <w:t xml:space="preserve">The typical company has somewhere between 50 and 300 employees, a founder or management team that built the original SaaS business, and a board or PE sponsor that is asking hard questions about when the AI investment starts showing up in the numbers.</w:t>
+        <w:t xml:space="preserve">PE-backed and growth-stage B2B vertical SaaS companies in the $10M–$75M revenue range that have built working AI but have not converted it into financial performance.</w:t>
+      </w:r>
+    </w:p>
+    <w:p>
+      <w:pPr>
+        <w:spacing w:after="200"/>
+      </w:pPr>
+      <w:r>
+        <w:rPr>
+          <w:sz w:val="24"/>
+          <w:szCs w:val="24"/>
+        </w:rPr>
+        <w:t xml:space="preserve">These are SaaS companies with real customers and working AI. But the commercial infrastructure was built for the SaaS model and is in the way of AI growth.</w:t>
+      </w:r>
+    </w:p>
+    <w:p>
+      <w:pPr>
+        <w:spacing w:after="200"/>
+      </w:pPr>
+      <w:r>
+        <w:rPr>
+          <w:sz w:val="24"/>
+          <w:szCs w:val="24"/>
+        </w:rPr>
+        <w:t xml:space="preserve">The company is stuck between two identities: a SaaS company that added AI features and an AI company that has not yet figured out how to turn what it’s built into a valuable company.</w:t>
+      </w:r>
+    </w:p>
+    <w:p>
+      <w:pPr>
+        <w:spacing w:after="100"/>
+      </w:pPr>
+      <w:r>
+        <w:rPr>
+          <w:sz w:val="24"/>
+          <w:szCs w:val="24"/>
+        </w:rPr>
+        <w:t xml:space="preserve">The profile is consistent. B2B SaaS. Vertical.</w:t>
+      </w:r>
+    </w:p>
+    <w:p>
+      <w:pPr>
+        <w:spacing w:after="100"/>
+        <w:ind w:left="360"/>
+      </w:pPr>
+      <w:r>
+        <w:rPr>
+          <w:sz w:val="24"/>
+          <w:szCs w:val="24"/>
+        </w:rPr>
+        <w:t xml:space="preserve">Serving mid-market or enterprise customers in workflows where AI can move a measurable line on the customer’s P&amp;L.</w:t>
+      </w:r>
+    </w:p>
+    <w:p>
+      <w:pPr>
+        <w:spacing w:after="100"/>
+        <w:ind w:left="360"/>
+      </w:pPr>
+      <w:r>
+        <w:rPr>
+          <w:b/>
+          <w:bCs/>
+          <w:sz w:val="24"/>
+          <w:szCs w:val="24"/>
+        </w:rPr>
+        <w:t xml:space="preserve">Verticals: </w:t>
+      </w:r>
+      <w:r>
+        <w:rPr>
+          <w:sz w:val="24"/>
+          <w:szCs w:val="24"/>
+        </w:rPr>
+        <w:t xml:space="preserve">Technology (Directly) and Retail (iAdvize) are the verticals I’ve worked deeply in most recently.</w:t>
+      </w:r>
+    </w:p>
+    <w:p>
+      <w:pPr>
+        <w:spacing w:after="100"/>
+        <w:ind w:left="360"/>
+      </w:pPr>
+      <w:r>
+        <w:rPr>
+          <w:b/>
+          <w:bCs/>
+          <w:sz w:val="24"/>
+          <w:szCs w:val="24"/>
+        </w:rPr>
+        <w:t xml:space="preserve">Domains: </w:t>
+      </w:r>
+      <w:r>
+        <w:rPr>
+          <w:sz w:val="24"/>
+          <w:szCs w:val="24"/>
+        </w:rPr>
+        <w:t xml:space="preserve">Customer experience, customer support, and e-commerce are the domains I know best.</w:t>
+      </w:r>
+    </w:p>
+    <w:p>
+      <w:pPr>
+        <w:spacing w:after="200"/>
+      </w:pPr>
+      <w:r>
+        <w:rPr>
+          <w:sz w:val="24"/>
+          <w:szCs w:val="24"/>
+        </w:rPr>
+        <w:t xml:space="preserve">But the pattern applies anywhere AI replaces labor-intensive workflow steps with outcome-based delivery.</w:t>
+      </w:r>
+    </w:p>
+    <w:p>
+      <w:pPr>
+        <w:spacing w:after="200"/>
+      </w:pPr>
+      <w:r>
+        <w:rPr>
+          <w:sz w:val="24"/>
+          <w:szCs w:val="24"/>
+        </w:rPr>
+        <w:t xml:space="preserve">The typical company has somewhere between 50–200 employees, a management team that built the original SaaS business, and a PE sponsor that is asking hard questions about when the AI investment starts showing up in the numbers and driving exit value (“AI → EBITDA”).</w:t>
       </w:r>
     </w:p>
     <w:p>
@@ -122,48 +217,46 @@
       </w:pPr>
       <w:r>
         <w:rPr>
-          <w:b/>
-          <w:bCs/>
-          <w:sz w:val="24"/>
-          <w:szCs w:val="24"/>
-        </w:rPr>
-        <w:t xml:space="preserve">The AI works but the business model doesn’t.</w:t>
-      </w:r>
-    </w:p>
-    <w:p>
-      <w:pPr>
-        <w:spacing w:after="200"/>
-      </w:pPr>
-      <w:r>
-        <w:rPr>
-          <w:sz w:val="24"/>
-          <w:szCs w:val="24"/>
-        </w:rPr>
-        <w:t xml:space="preserve">At entry, the company has proven AI capability—maybe an agent, maybe an automation layer, maybe an AI-augmented workflow—that demonstrably solves a customer problem. But the financial results have not followed. Growth has stalled or slowed. Margins are flat or compressing. The AI is live but it is not showing up in ARR growth, EBITDA expansion, or valuation multiples.</w:t>
-      </w:r>
-    </w:p>
-    <w:p>
-      <w:pPr>
-        <w:spacing w:after="200"/>
-      </w:pPr>
-      <w:r>
-        <w:rPr>
-          <w:sz w:val="24"/>
-          <w:szCs w:val="24"/>
-        </w:rPr>
-        <w:t xml:space="preserve">The root cause is almost always the same: the company is trying to sell AI through a SaaS commercial model. Seat-based pricing on something that eliminates seats. Nine-month enterprise sales cycles on something that can prove value in 60 days. An 18-product portfolio when the AI only needs one workflow to deliver measurable customer ROI. The operating model is the bottleneck, not the technology.</w:t>
-      </w:r>
-    </w:p>
-    <w:p>
-      <w:pPr>
-        <w:spacing w:after="200"/>
-      </w:pPr>
-      <w:r>
-        <w:rPr>
-          <w:sz w:val="24"/>
-          <w:szCs w:val="24"/>
-        </w:rPr>
-        <w:t xml:space="preserve">From a PE perspective, this is a portfolio company where the thesis around AI-driven value creation is intact but the execution layer—commercial infrastructure, pricing architecture, GTM motion, and operating cadence—needs to be rebuilt by someone who has done it before. The management team built a good SaaS company. They have not yet built the AI company that replaces it.</w:t>
+          <w:sz w:val="24"/>
+          <w:szCs w:val="24"/>
+        </w:rPr>
+        <w:t xml:space="preserve">The company has a SaaS product but SaaS growth has stalled or is declining. It is beginning to compete with AI-native competitors.</w:t>
+      </w:r>
+    </w:p>
+    <w:p>
+      <w:pPr>
+        <w:spacing w:after="200"/>
+      </w:pPr>
+      <w:r>
+        <w:rPr>
+          <w:sz w:val="24"/>
+          <w:szCs w:val="24"/>
+        </w:rPr>
+        <w:t xml:space="preserve">At entry, the company has proven AI capability—an agent, automation layer, AI-augmented workflow. But AI has not generated ARR growth and EBITDA margin expansion.</w:t>
+      </w:r>
+    </w:p>
+    <w:p>
+      <w:pPr>
+        <w:spacing w:after="200"/>
+      </w:pPr>
+      <w:r>
+        <w:rPr>
+          <w:sz w:val="24"/>
+          <w:szCs w:val="24"/>
+        </w:rPr>
+        <w:t xml:space="preserve">The commercial model is still SaaS. Seat-based pricing on something that eliminates seats. Nine-month enterprise sales cycles on something that can prove value in 60 days. A multi-product portfolio when the AI only needs one workflow to deliver measurable customer ROI. Pricing, GTM, and operating cadence haven’t been rebuilt for AI delivery. The operating model is the bottleneck.</w:t>
+      </w:r>
+    </w:p>
+    <w:p>
+      <w:pPr>
+        <w:spacing w:after="200"/>
+      </w:pPr>
+      <w:r>
+        <w:rPr>
+          <w:sz w:val="24"/>
+          <w:szCs w:val="24"/>
+        </w:rPr>
+        <w:t xml:space="preserve">From a PE perspective, this is a portfolio company where the thesis around AI-driven value creation is intact but the execution layer—commercial infrastructure, pricing architecture, GTM motion, and operating cadence—needs an operator who has done it before. I go in as CEO. Collapse the portfolio. Reset GTM. Convert AI to EBITDA.</w:t>
       </w:r>
     </w:p>
     <w:p>
@@ -202,6 +295,27 @@
           <w:sz w:val="24"/>
           <w:szCs w:val="24"/>
         </w:rPr>
+        <w:t xml:space="preserve">AI ARR: </w:t>
+      </w:r>
+      <w:r>
+        <w:rPr>
+          <w:sz w:val="24"/>
+          <w:szCs w:val="24"/>
+        </w:rPr>
+        <w:t xml:space="preserve">Target measurable AI-sourced ARR as a discrete, growing line item. At iAdvize, AI revenue went from $0 to $10M+ ARR in 24 months and overtook legacy SaaS revenue. The first 12 months should establish the AI revenue trajectory, compress sales cycles, and prove that the new commercial model converts. Trial-to-paid conversion should improve materially—at iAdvize it tripled in the first cohorts.</w:t>
+      </w:r>
+    </w:p>
+    <w:p>
+      <w:pPr>
+        <w:spacing w:after="200"/>
+      </w:pPr>
+      <w:r>
+        <w:rPr>
+          <w:b/>
+          <w:bCs/>
+          <w:sz w:val="24"/>
+          <w:szCs w:val="24"/>
+        </w:rPr>
         <w:t xml:space="preserve">EBITDA: </w:t>
       </w:r>
       <w:r>
@@ -209,28 +323,7 @@
           <w:sz w:val="24"/>
           <w:szCs w:val="24"/>
         </w:rPr>
-        <w:t xml:space="preserve">Target 15–25% EBITDA margin from a restructured cost base and improved revenue quality. At Directly, I took the company from burning $1.2M per month to 22% EBITDA margin, expanding to 31% at exit. The lever is not just cost cutting—it is rationalizing low-margin accounts, rebuilding pricing to capture AI value, and aligning delivery costs to outcome-based economics.</w:t>
-      </w:r>
-    </w:p>
-    <w:p>
-      <w:pPr>
-        <w:spacing w:after="200"/>
-      </w:pPr>
-      <w:r>
-        <w:rPr>
-          <w:b/>
-          <w:bCs/>
-          <w:sz w:val="24"/>
-          <w:szCs w:val="24"/>
-        </w:rPr>
-        <w:t xml:space="preserve">ARR: </w:t>
-      </w:r>
-      <w:r>
-        <w:rPr>
-          <w:sz w:val="24"/>
-          <w:szCs w:val="24"/>
-        </w:rPr>
-        <w:t xml:space="preserve">Target measurable AI-sourced ARR as a discrete, growing line item. At iAdvize, AI revenue went from $0 to $10M+ ARR in 24 months and overtook legacy SaaS revenue. The first 12 months should establish the AI revenue trajectory, compress sales cycles, and prove that the new commercial model converts. Trial-to-paid conversion should improve materially—at iAdvize it tripled in the first cohorts.</w:t>
+        <w:t xml:space="preserve">Rationalized the SaaS asset to increase EBITDA margin in a declining business. Target AI EBITDA ~80% in 12 months from aligning pricing with customer EBITDA created and installing an operating cadence to drive the outcome. At Directly, I took EBITDA from negative to 22%+ and maintained that two years while we rationalized the account base. Revenue durability improved and EBITDA margins expanded to 31% at exit.</w:t>
       </w:r>
     </w:p>
     <w:p>
@@ -403,19 +496,40 @@
           <w:sz w:val="24"/>
           <w:szCs w:val="24"/>
         </w:rPr>
-        <w:t xml:space="preserve">Proof Point 1: Directly — CEO, PE Exit</w:t>
-      </w:r>
-    </w:p>
-    <w:p>
-      <w:pPr>
-        <w:spacing w:after="200"/>
-      </w:pPr>
-      <w:r>
-        <w:rPr>
-          <w:sz w:val="24"/>
-          <w:szCs w:val="24"/>
-        </w:rPr>
-        <w:t xml:space="preserve">Joined as CBO, grew ARR from $3.7M to $8M+ through revenue quality improvement and enterprise account expansion. Promoted to CEO when the company’s obligations exceeded its cash and monthly burn hit $1.2M. Raised funding 19 days after the pandemic was declared. Led the full re-founding as CEO: rebuilt cost architecture, rationalized low-margin accounts, shifted to per-resolution AI pricing. Sustained 22%+ EBITDA margin, expanding to 31% at exit. The Instant Answers AI drove roughly 50% of EBITDA at exit. Led the complete exit process—advisor selection, diligence, negotiation, and board coordination—culminating in an asset sale to a PE-backed portfolio company. Enterprise customers included Microsoft, Airbnb, AT&amp;T, and SAP.</w:t>
+        <w:t xml:space="preserve">Proof Point 1: Directly — CEO, Exit (Asset Sale)</w:t>
+      </w:r>
+    </w:p>
+    <w:p>
+      <w:pPr>
+        <w:spacing w:after="200"/>
+      </w:pPr>
+      <w:r>
+        <w:rPr>
+          <w:sz w:val="24"/>
+          <w:szCs w:val="24"/>
+        </w:rPr>
+        <w:t xml:space="preserve">Directly was a vertical AI support platform serving Microsoft, Airbnb, AT&amp;T, and SAP. Grew ARR from $3.7M to $8M+ by rationalizing low-margin accounts and expanding enterprise accounts. Promoted to CEO when obligations exceeded cash and burn hit $1.2M per month. Raised funding 19 days after the pandemic was declared, then rebuilt the company around AI-first delivery. Instant Answers AI, built on pre-LLM intent-based technology, drove roughly 50% of EBITDA at exit.</w:t>
+      </w:r>
+    </w:p>
+    <w:p>
+      <w:pPr>
+        <w:spacing w:after="200"/>
+      </w:pPr>
+      <w:r>
+        <w:rPr>
+          <w:b/>
+          <w:bCs/>
+          <w:sz w:val="24"/>
+          <w:szCs w:val="24"/>
+        </w:rPr>
+        <w:t xml:space="preserve">Exit: </w:t>
+      </w:r>
+      <w:r>
+        <w:rPr>
+          <w:sz w:val="24"/>
+          <w:szCs w:val="24"/>
+        </w:rPr>
+        <w:t xml:space="preserve">EBITDA margin reached 22%+ (and expanded to 31% at exit). Led the complete exit process as CEO, from advisor selection through diligence, negotiation, and board coordination. Asset sale to a PE-backed portfolio company.</w:t>
       </w:r>
     </w:p>
     <w:p>
@@ -441,7 +555,19 @@
           <w:sz w:val="24"/>
           <w:szCs w:val="24"/>
         </w:rPr>
-        <w:t xml:space="preserve">Led the re-founding alongside the CEO. The company was a 360-degree CX platform with 18 products positioned as everything to everyone. Collapsed the portfolio to two: one vertical AI agent for e-commerce and one SaaS add-on. Built AI revenue from $0 to $10M+ ARR in 24 months. The AI revenue overtook legacy SaaS. Compressed acquisition cycles from roughly 9 months to 60 days. Trial-to-paid conversion tripled in the first cohorts. Rebuilt the entire commercial model around consumption-based AI pricing.</w:t>
+        <w:t xml:space="preserve">iAdvize was positioned as a 360-degree CX platform with 18 products. Re-founded the company by collapsing 18 products into one vertical AI agent for e-commerce. The portfolio became two: one AI agent and one SaaS product.</w:t>
+      </w:r>
+    </w:p>
+    <w:p>
+      <w:pPr>
+        <w:spacing w:after="200"/>
+      </w:pPr>
+      <w:r>
+        <w:rPr>
+          <w:sz w:val="24"/>
+          <w:szCs w:val="24"/>
+        </w:rPr>
+        <w:t xml:space="preserve">We focused the company on one AI agent for one high-value workflow. Onboarding compressed. Trial-to-paid conversion tripled in the first cohorts. AI revenue scaled from $0 to $10M+ ARR in 24 months and overtook SaaS.</w:t>
       </w:r>
     </w:p>
     <w:p>
@@ -455,19 +581,139 @@
           <w:sz w:val="24"/>
           <w:szCs w:val="24"/>
         </w:rPr>
-        <w:t xml:space="preserve">Proof Point 3: The Pattern</w:t>
-      </w:r>
-    </w:p>
-    <w:p>
-      <w:pPr>
-        <w:spacing w:after="200"/>
-      </w:pPr>
-      <w:r>
-        <w:rPr>
-          <w:sz w:val="24"/>
-          <w:szCs w:val="24"/>
-        </w:rPr>
-        <w:t xml:space="preserve">Two different companies. Two different boards. Two different markets. Same problem: the AI worked before the commercial model did. Same playbook: concentrate the portfolio, anchor to customer EBITDA, reprice for outcomes, rebuild GTM for proof-first delivery, run a weekly operating cadence. Same result: AI showed up in EBITDA. This is not a framework I theorize about. It is a playbook I have executed under live operating pressure, twice, with board-level accountability and real financial outcomes.</w:t>
+        <w:t xml:space="preserve">Proof Point 3: HP Enterprise Services</w:t>
+      </w:r>
+    </w:p>
+    <w:p>
+      <w:pPr>
+        <w:spacing w:after="200"/>
+      </w:pPr>
+      <w:r>
+        <w:rPr>
+          <w:i/>
+          <w:iCs/>
+          <w:sz w:val="24"/>
+          <w:szCs w:val="24"/>
+        </w:rPr>
+        <w:t xml:space="preserve">VP, $250M P&amp;L, Margin Expansion at Scale</w:t>
+      </w:r>
+    </w:p>
+    <w:p>
+      <w:pPr>
+        <w:spacing w:after="200"/>
+      </w:pPr>
+      <w:r>
+        <w:rPr>
+          <w:sz w:val="24"/>
+          <w:szCs w:val="24"/>
+        </w:rPr>
+        <w:t xml:space="preserve">Vice President &amp; GM leading Global Delivery and Industry Solutions. Ran a $250M+ P&amp;L across a 15,000-person global organization.</w:t>
+      </w:r>
+    </w:p>
+    <w:p>
+      <w:pPr>
+        <w:spacing w:after="200"/>
+      </w:pPr>
+      <w:r>
+        <w:rPr>
+          <w:sz w:val="24"/>
+          <w:szCs w:val="24"/>
+        </w:rPr>
+        <w:t xml:space="preserve">The core problem was the same one I solve now at a smaller scale: a reset of the operating model. Removed $200M+ in cost from a $4B global services business.</w:t>
+      </w:r>
+    </w:p>
+    <w:p>
+      <w:pPr>
+        <w:pStyle w:val="ListParagraph"/>
+        <w:numPr>
+          <w:ilvl w:val="0"/>
+          <w:numId w:val="2"/>
+        </w:numPr>
+        <w:spacing w:after="200"/>
+      </w:pPr>
+      <w:r>
+        <w:rPr>
+          <w:sz w:val="24"/>
+          <w:szCs w:val="24"/>
+        </w:rPr>
+        <w:t xml:space="preserve">Rationalized a fragmented vertical IP portfolio, reducing R&amp;D spend by $48M annually and reallocating capital to higher-return, margin-accretive offerings. Savings directly flowed to EBITDA. Investments supported profitable growth.</w:t>
+      </w:r>
+    </w:p>
+    <w:p>
+      <w:pPr>
+        <w:pStyle w:val="ListParagraph"/>
+        <w:numPr>
+          <w:ilvl w:val="0"/>
+          <w:numId w:val="2"/>
+        </w:numPr>
+        <w:spacing w:after="200"/>
+      </w:pPr>
+      <w:r>
+        <w:rPr>
+          <w:sz w:val="24"/>
+          <w:szCs w:val="24"/>
+        </w:rPr>
+        <w:t xml:space="preserve">Drove lift-and-shift of onshore delivery work to industrialized offshore delivery plus automation. Removed $200M+ in structural cost from managed services contracts, flowing the savings to EBITDA.</w:t>
+      </w:r>
+    </w:p>
+    <w:p>
+      <w:pPr>
+        <w:spacing w:after="200"/>
+      </w:pPr>
+      <w:r>
+        <w:rPr>
+          <w:sz w:val="24"/>
+          <w:szCs w:val="24"/>
+        </w:rPr>
+        <w:t xml:space="preserve">This is where the operating discipline behind Directly and iAdvize comes from — running P&amp;L transformation at enterprise scale, with the same levers: portfolio rationalization, cost architecture, revenue quality, and operating cadence.</w:t>
+      </w:r>
+    </w:p>
+    <w:p>
+      <w:pPr>
+        <w:spacing w:after="120"/>
+      </w:pPr>
+      <w:r>
+        <w:rPr>
+          <w:b/>
+          <w:bCs/>
+          <w:sz w:val="24"/>
+          <w:szCs w:val="24"/>
+        </w:rPr>
+        <w:t xml:space="preserve">Proof Point X: Transferable Playbook </w:t>
+      </w:r>
+      <w:r>
+        <w:rPr>
+          <w:i/>
+          <w:iCs/>
+          <w:color w:val="666666"/>
+          <w:sz w:val="24"/>
+          <w:szCs w:val="24"/>
+        </w:rPr>
+        <w:t xml:space="preserve">(Optional)</w:t>
+      </w:r>
+    </w:p>
+    <w:p>
+      <w:pPr>
+        <w:spacing w:after="200"/>
+      </w:pPr>
+      <w:r>
+        <w:rPr>
+          <w:sz w:val="24"/>
+          <w:szCs w:val="24"/>
+        </w:rPr>
+        <w:t xml:space="preserve">The playbook from Directly and iAdvize is not institutional memory — it is a documented, published operating system. Five frameworks, each built in production and tested across both re-foundings: SaaS to AI Re-founding, The AI to EBITDA Playbook, How to Price AI Agents, The AI Commercial Model, and The AI Operating Cadence. Each framework maps directly to a stage of the conversion from working AI to durable EBITDA.</w:t>
+      </w:r>
+    </w:p>
+    <w:p>
+      <w:pPr>
+        <w:spacing w:after="200"/>
+      </w:pPr>
+      <w:r>
+        <w:rPr>
+          <w:sz w:val="24"/>
+          <w:szCs w:val="24"/>
+        </w:rPr>
+        <w:t xml:space="preserve">They are published at mikedelacruz.com/frameworks — not behind a gate, not in a pitch deck. A PE operating partner can read the full methodology before a first conversation. The system is transferable because it was designed to be transferred.</w:t>
       </w:r>
     </w:p>
     <w:p>
@@ -484,13 +730,27 @@
       </w:pPr>
       <w:r>
         <w:rPr>
+          <w:b/>
+          <w:bCs/>
+          <w:sz w:val="24"/>
+          <w:szCs w:val="24"/>
+        </w:rPr>
+        <w:t xml:space="preserve">If your portfolio company has AI that isn’t yet showing up in EBITDA, I’ve solved that problem twice.</w:t>
+      </w:r>
+    </w:p>
+    <w:p>
+      <w:pPr>
+        <w:spacing w:after="200"/>
+      </w:pPr>
+      <w:r>
+        <w:rPr>
           <w:i/>
           <w:iCs/>
           <w:color w:val="666666"/>
           <w:sz w:val="24"/>
           <w:szCs w:val="24"/>
         </w:rPr>
-        <w:t xml:space="preserve">This is a rough draft. The bio, case studies, site copy, and LinkedIn positioning all flow from this document. Nothing else gets finalized until this is right.</w:t>
+        <w:t xml:space="preserve">The bio, case studies, site copy, and LinkedIn positioning all flow from this document.</w:t>
       </w:r>
     </w:p>
     <w:p>
@@ -690,8 +950,26 @@
       </w:pPr>
     </w:lvl>
   </w:abstractNum>
+  <w:abstractNum w:abstractNumId="2" w15:restartNumberingAfterBreak="0">
+    <w:multiLevelType w:val="hybridMultilevel"/>
+    <w:lvl w:ilvl="0" w15:tentative="1">
+      <w:start w:val="1"/>
+      <w:numFmt w:val="decimal"/>
+      <w:lvlText w:val="%1)"/>
+      <w:lvlJc w:val="left"/>
+      <w:pPr>
+        <w:ind w:left="720" w:hanging="360"/>
+      </w:pPr>
+    </w:lvl>
+  </w:abstractNum>
   <w:num w:numId="1">
     <w:abstractNumId w:val="1"/>
+    <w:lvlOverride w:ilvl="0">
+      <w:startOverride w:val="1"/>
+    </w:lvlOverride>
+  </w:num>
+  <w:num w:numId="2">
+    <w:abstractNumId w:val="2"/>
     <w:lvlOverride w:ilvl="0">
       <w:startOverride w:val="1"/>
     </w:lvlOverride>

</xml_diff>